<commit_message>
Updating code and files from maaslin2 stratified and merged stratified output pathways
</commit_message>
<xml_diff>
--- a/methods_t1d_dcm_04272026.docx
+++ b/methods_t1d_dcm_04272026.docx
@@ -3744,7 +3744,39 @@
           <w:sz w:val="22"/>
           <w:szCs w:val="22"/>
         </w:rPr>
-        <w:t xml:space="preserve"> -o &lt;community_specific_and_function_specific_metagenome_prediction_file.tsv&gt;) </w:t>
+        <w:t xml:space="preserve"> </w:t>
+      </w:r>
+      <w:r>
+        <w:rPr>
+          <w:rFonts w:ascii="Times New Roman" w:hAnsi="Times New Roman" w:cs="Times New Roman"/>
+          <w:sz w:val="22"/>
+          <w:szCs w:val="22"/>
+        </w:rPr>
+        <w:t xml:space="preserve">-p 32 </w:t>
+      </w:r>
+      <w:r>
+        <w:rPr>
+          <w:rFonts w:ascii="Times New Roman" w:hAnsi="Times New Roman" w:cs="Times New Roman"/>
+          <w:sz w:val="22"/>
+          <w:szCs w:val="22"/>
+        </w:rPr>
+        <w:t>-o &lt;community_specific_and_function_specific_metagenome_prediction_</w:t>
+      </w:r>
+      <w:r>
+        <w:rPr>
+          <w:rFonts w:ascii="Times New Roman" w:hAnsi="Times New Roman" w:cs="Times New Roman"/>
+          <w:sz w:val="22"/>
+          <w:szCs w:val="22"/>
+        </w:rPr>
+        <w:t>directory</w:t>
+      </w:r>
+      <w:r>
+        <w:rPr>
+          <w:rFonts w:ascii="Times New Roman" w:hAnsi="Times New Roman" w:cs="Times New Roman"/>
+          <w:sz w:val="22"/>
+          <w:szCs w:val="22"/>
+        </w:rPr>
+        <w:t xml:space="preserve">&gt;) </w:t>
       </w:r>
       <w:r>
         <w:rPr>
@@ -3813,6 +3845,14 @@
           <w:sz w:val="22"/>
           <w:szCs w:val="22"/>
         </w:rPr>
+        <w:t>output_</w:t>
+      </w:r>
+      <w:r>
+        <w:rPr>
+          <w:rFonts w:ascii="Times New Roman" w:hAnsi="Times New Roman" w:cs="Times New Roman"/>
+          <w:sz w:val="22"/>
+          <w:szCs w:val="22"/>
+        </w:rPr>
         <w:t>community_specific_pathway_inference_directory</w:t>
       </w:r>
       <w:proofErr w:type="spellEnd"/>
@@ -3831,6 +3871,14 @@
           <w:sz w:val="22"/>
           <w:szCs w:val="22"/>
         </w:rPr>
+        <w:t>output_</w:t>
+      </w:r>
+      <w:r>
+        <w:rPr>
+          <w:rFonts w:ascii="Times New Roman" w:hAnsi="Times New Roman" w:cs="Times New Roman"/>
+          <w:sz w:val="22"/>
+          <w:szCs w:val="22"/>
+        </w:rPr>
         <w:t>community_specific_pathway_intermediate_files.tsv</w:t>
       </w:r>
       <w:proofErr w:type="spellEnd"/>
@@ -3849,7 +3897,15 @@
           <w:sz w:val="22"/>
           <w:szCs w:val="22"/>
         </w:rPr>
-        <w:t>per_sequence_contribution</w:t>
+        <w:t>per_sequence_contri</w:t>
+      </w:r>
+      <w:r>
+        <w:rPr>
+          <w:rFonts w:ascii="Times New Roman" w:hAnsi="Times New Roman" w:cs="Times New Roman"/>
+          <w:sz w:val="22"/>
+          <w:szCs w:val="22"/>
+        </w:rPr>
+        <w:t>b</w:t>
       </w:r>
       <w:proofErr w:type="spellEnd"/>
       <w:r>

</xml_diff>

<commit_message>
Update SickKids analysis scripts and methods
</commit_message>
<xml_diff>
--- a/methods_t1d_dcm_04272026.docx
+++ b/methods_t1d_dcm_04272026.docx
@@ -68,6 +68,968 @@
         <w:jc w:val="both"/>
         <w:rPr>
           <w:rFonts w:ascii="Times New Roman" w:hAnsi="Times New Roman" w:cs="Times New Roman"/>
+          <w:sz w:val="22"/>
+          <w:szCs w:val="22"/>
+        </w:rPr>
+      </w:pPr>
+    </w:p>
+    <w:p>
+      <w:pPr>
+        <w:spacing w:line="480" w:lineRule="auto"/>
+        <w:jc w:val="both"/>
+        <w:rPr>
+          <w:rFonts w:ascii="Times New Roman" w:hAnsi="Times New Roman" w:cs="Times New Roman"/>
+          <w:sz w:val="22"/>
+          <w:szCs w:val="22"/>
+        </w:rPr>
+      </w:pPr>
+      <w:r>
+        <w:rPr>
+          <w:rFonts w:ascii="Times New Roman" w:hAnsi="Times New Roman" w:cs="Times New Roman"/>
+          <w:sz w:val="22"/>
+          <w:szCs w:val="22"/>
+        </w:rPr>
+        <w:t>When comparing the significantly enriched pathways between NS1 and S2 at week</w:t>
+      </w:r>
+      <w:r>
+        <w:rPr>
+          <w:rFonts w:ascii="Times New Roman" w:hAnsi="Times New Roman" w:cs="Times New Roman"/>
+          <w:sz w:val="22"/>
+          <w:szCs w:val="22"/>
+        </w:rPr>
+        <w:t>s</w:t>
+      </w:r>
+      <w:r>
+        <w:rPr>
+          <w:rFonts w:ascii="Times New Roman" w:hAnsi="Times New Roman" w:cs="Times New Roman"/>
+          <w:sz w:val="22"/>
+          <w:szCs w:val="22"/>
+        </w:rPr>
+        <w:t xml:space="preserve"> 9 and 10, we observed a total of 27 enriched pathways in NS1. When repeating the same analysis between NS6 and S5 at the same time point, we also observed 27 significantly enriched metabolic pathways. However, when comparing the specific pathways deemed to be enriched, 16 (42.1%) were overlapped by both NS1 and NS6, and 11 were unique for each community (Supplementary figure X).</w:t>
+      </w:r>
+      <w:r>
+        <w:rPr>
+          <w:rFonts w:ascii="Times New Roman" w:hAnsi="Times New Roman" w:cs="Times New Roman"/>
+          <w:sz w:val="22"/>
+          <w:szCs w:val="22"/>
+        </w:rPr>
+        <w:t xml:space="preserve"> </w:t>
+      </w:r>
+    </w:p>
+    <w:p>
+      <w:pPr>
+        <w:spacing w:line="480" w:lineRule="auto"/>
+        <w:jc w:val="both"/>
+        <w:rPr>
+          <w:rFonts w:ascii="Times New Roman" w:hAnsi="Times New Roman" w:cs="Times New Roman"/>
+          <w:sz w:val="22"/>
+          <w:szCs w:val="22"/>
+        </w:rPr>
+      </w:pPr>
+    </w:p>
+    <w:p>
+      <w:pPr>
+        <w:spacing w:line="480" w:lineRule="auto"/>
+        <w:jc w:val="both"/>
+        <w:rPr>
+          <w:rFonts w:ascii="Times New Roman" w:hAnsi="Times New Roman" w:cs="Times New Roman"/>
+          <w:sz w:val="22"/>
+          <w:szCs w:val="22"/>
+        </w:rPr>
+      </w:pPr>
+      <w:r>
+        <w:rPr>
+          <w:rFonts w:ascii="Times New Roman" w:hAnsi="Times New Roman" w:cs="Times New Roman"/>
+          <w:sz w:val="22"/>
+          <w:szCs w:val="22"/>
+        </w:rPr>
+        <w:t xml:space="preserve">In the unique pathways, NS1 has two pathways involved in methionine biosynthesis and </w:t>
+      </w:r>
+      <w:proofErr w:type="spellStart"/>
+      <w:r>
+        <w:rPr>
+          <w:rFonts w:ascii="Times New Roman" w:hAnsi="Times New Roman" w:cs="Times New Roman"/>
+          <w:sz w:val="22"/>
+          <w:szCs w:val="22"/>
+        </w:rPr>
+        <w:t>teichoacid</w:t>
+      </w:r>
+      <w:proofErr w:type="spellEnd"/>
+      <w:r>
+        <w:rPr>
+          <w:rFonts w:ascii="Times New Roman" w:hAnsi="Times New Roman" w:cs="Times New Roman"/>
+          <w:sz w:val="22"/>
+          <w:szCs w:val="22"/>
+        </w:rPr>
+        <w:t xml:space="preserve"> synthesis that are not present in NS6. However, propionate degradation (PWY0-1277) while unique in NS1, it shares some similarities in function terms with P281-PWY</w:t>
+      </w:r>
+    </w:p>
+    <w:p>
+      <w:pPr>
+        <w:spacing w:line="480" w:lineRule="auto"/>
+        <w:jc w:val="both"/>
+        <w:rPr>
+          <w:rFonts w:ascii="Times New Roman" w:hAnsi="Times New Roman" w:cs="Times New Roman"/>
+          <w:sz w:val="22"/>
+          <w:szCs w:val="22"/>
+        </w:rPr>
+      </w:pPr>
+      <w:r>
+        <w:rPr>
+          <w:rFonts w:ascii="Times New Roman" w:hAnsi="Times New Roman" w:cs="Times New Roman"/>
+          <w:sz w:val="22"/>
+          <w:szCs w:val="22"/>
+        </w:rPr>
+        <w:t xml:space="preserve">3 </w:t>
+      </w:r>
+      <w:proofErr w:type="spellStart"/>
+      <w:r>
+        <w:rPr>
+          <w:rFonts w:ascii="Times New Roman" w:hAnsi="Times New Roman" w:cs="Times New Roman"/>
+          <w:sz w:val="22"/>
+          <w:szCs w:val="22"/>
+        </w:rPr>
+        <w:t>Phenylpropanoate</w:t>
+      </w:r>
+      <w:proofErr w:type="spellEnd"/>
+      <w:r>
+        <w:rPr>
+          <w:rFonts w:ascii="Times New Roman" w:hAnsi="Times New Roman" w:cs="Times New Roman"/>
+          <w:sz w:val="22"/>
+          <w:szCs w:val="22"/>
+        </w:rPr>
+        <w:t xml:space="preserve"> degradation two </w:t>
+      </w:r>
+      <w:proofErr w:type="gramStart"/>
+      <w:r>
+        <w:rPr>
+          <w:rFonts w:ascii="Times New Roman" w:hAnsi="Times New Roman" w:cs="Times New Roman"/>
+          <w:sz w:val="22"/>
+          <w:szCs w:val="22"/>
+        </w:rPr>
+        <w:t>present</w:t>
+      </w:r>
+      <w:proofErr w:type="gramEnd"/>
+      <w:r>
+        <w:rPr>
+          <w:rFonts w:ascii="Times New Roman" w:hAnsi="Times New Roman" w:cs="Times New Roman"/>
+          <w:sz w:val="22"/>
+          <w:szCs w:val="22"/>
+        </w:rPr>
+        <w:t xml:space="preserve"> in NS1, one in NS6</w:t>
+      </w:r>
+    </w:p>
+    <w:p>
+      <w:pPr>
+        <w:spacing w:line="480" w:lineRule="auto"/>
+        <w:jc w:val="both"/>
+        <w:rPr>
+          <w:rFonts w:ascii="Times New Roman" w:hAnsi="Times New Roman" w:cs="Times New Roman"/>
+          <w:sz w:val="22"/>
+          <w:szCs w:val="22"/>
+        </w:rPr>
+      </w:pPr>
+      <w:r>
+        <w:rPr>
+          <w:rFonts w:ascii="Times New Roman" w:hAnsi="Times New Roman" w:cs="Times New Roman"/>
+          <w:sz w:val="22"/>
+          <w:szCs w:val="22"/>
+        </w:rPr>
+        <w:t>NAD salvage pathway only present in NS1</w:t>
+      </w:r>
+    </w:p>
+    <w:p>
+      <w:pPr>
+        <w:spacing w:line="480" w:lineRule="auto"/>
+        <w:jc w:val="both"/>
+        <w:rPr>
+          <w:rFonts w:ascii="Times New Roman" w:hAnsi="Times New Roman" w:cs="Times New Roman"/>
+          <w:sz w:val="22"/>
+          <w:szCs w:val="22"/>
+        </w:rPr>
+      </w:pPr>
+      <w:r>
+        <w:rPr>
+          <w:rFonts w:ascii="Times New Roman" w:hAnsi="Times New Roman" w:cs="Times New Roman"/>
+          <w:sz w:val="22"/>
+          <w:szCs w:val="22"/>
+        </w:rPr>
+        <w:t xml:space="preserve">Phenylethylamine </w:t>
+      </w:r>
+      <w:proofErr w:type="spellStart"/>
+      <w:r>
+        <w:rPr>
+          <w:rFonts w:ascii="Times New Roman" w:hAnsi="Times New Roman" w:cs="Times New Roman"/>
+          <w:sz w:val="22"/>
+          <w:szCs w:val="22"/>
+        </w:rPr>
+        <w:t>superpathway</w:t>
+      </w:r>
+      <w:proofErr w:type="spellEnd"/>
+      <w:r>
+        <w:rPr>
+          <w:rFonts w:ascii="Times New Roman" w:hAnsi="Times New Roman" w:cs="Times New Roman"/>
+          <w:sz w:val="22"/>
+          <w:szCs w:val="22"/>
+        </w:rPr>
+        <w:t xml:space="preserve"> only present in NS1</w:t>
+      </w:r>
+    </w:p>
+    <w:p>
+      <w:pPr>
+        <w:spacing w:line="480" w:lineRule="auto"/>
+        <w:jc w:val="both"/>
+        <w:rPr>
+          <w:rFonts w:ascii="Times New Roman" w:hAnsi="Times New Roman" w:cs="Times New Roman"/>
+          <w:sz w:val="22"/>
+          <w:szCs w:val="22"/>
+        </w:rPr>
+      </w:pPr>
+      <w:r>
+        <w:rPr>
+          <w:rFonts w:ascii="Times New Roman" w:hAnsi="Times New Roman" w:cs="Times New Roman"/>
+          <w:sz w:val="22"/>
+          <w:szCs w:val="22"/>
+        </w:rPr>
+        <w:t>Phenylacetate degradation only NS1</w:t>
+      </w:r>
+    </w:p>
+    <w:p>
+      <w:pPr>
+        <w:spacing w:line="480" w:lineRule="auto"/>
+        <w:jc w:val="both"/>
+        <w:rPr>
+          <w:rFonts w:ascii="Times New Roman" w:hAnsi="Times New Roman" w:cs="Times New Roman"/>
+          <w:sz w:val="22"/>
+          <w:szCs w:val="22"/>
+        </w:rPr>
+      </w:pPr>
+      <w:r>
+        <w:rPr>
+          <w:rFonts w:ascii="Times New Roman" w:hAnsi="Times New Roman" w:cs="Times New Roman"/>
+          <w:sz w:val="22"/>
+          <w:szCs w:val="22"/>
+        </w:rPr>
+        <w:t>Gallate degradation only in NS1</w:t>
+      </w:r>
+    </w:p>
+    <w:p>
+      <w:pPr>
+        <w:spacing w:line="480" w:lineRule="auto"/>
+        <w:jc w:val="both"/>
+        <w:rPr>
+          <w:rFonts w:ascii="Times New Roman" w:hAnsi="Times New Roman" w:cs="Times New Roman"/>
+          <w:sz w:val="22"/>
+          <w:szCs w:val="22"/>
+        </w:rPr>
+      </w:pPr>
+      <w:r>
+        <w:rPr>
+          <w:rFonts w:ascii="Times New Roman" w:hAnsi="Times New Roman" w:cs="Times New Roman"/>
+          <w:sz w:val="22"/>
+          <w:szCs w:val="22"/>
+        </w:rPr>
+        <w:t>Polyamine biosynthesis in NS1 (POLYAMINSYN3-PWY) but 4 pathways related to polyamine degradation in NS6.</w:t>
+      </w:r>
+    </w:p>
+    <w:p>
+      <w:pPr>
+        <w:spacing w:line="480" w:lineRule="auto"/>
+        <w:jc w:val="both"/>
+        <w:rPr>
+          <w:rFonts w:ascii="Times New Roman" w:hAnsi="Times New Roman" w:cs="Times New Roman"/>
+          <w:sz w:val="22"/>
+          <w:szCs w:val="22"/>
+        </w:rPr>
+      </w:pPr>
+    </w:p>
+    <w:p>
+      <w:pPr>
+        <w:spacing w:line="480" w:lineRule="auto"/>
+        <w:jc w:val="both"/>
+        <w:rPr>
+          <w:rFonts w:ascii="Times New Roman" w:hAnsi="Times New Roman" w:cs="Times New Roman"/>
+          <w:sz w:val="22"/>
+          <w:szCs w:val="22"/>
+        </w:rPr>
+      </w:pPr>
+    </w:p>
+    <w:p>
+      <w:pPr>
+        <w:spacing w:line="480" w:lineRule="auto"/>
+        <w:jc w:val="both"/>
+        <w:rPr>
+          <w:rFonts w:ascii="Times New Roman" w:hAnsi="Times New Roman" w:cs="Times New Roman"/>
+          <w:sz w:val="22"/>
+          <w:szCs w:val="22"/>
+        </w:rPr>
+      </w:pPr>
+    </w:p>
+    <w:p>
+      <w:pPr>
+        <w:spacing w:line="480" w:lineRule="auto"/>
+        <w:jc w:val="both"/>
+        <w:rPr>
+          <w:rFonts w:ascii="Times New Roman" w:hAnsi="Times New Roman" w:cs="Times New Roman"/>
+          <w:sz w:val="22"/>
+          <w:szCs w:val="22"/>
+        </w:rPr>
+      </w:pPr>
+    </w:p>
+    <w:p>
+      <w:pPr>
+        <w:spacing w:line="480" w:lineRule="auto"/>
+        <w:jc w:val="both"/>
+        <w:rPr>
+          <w:rFonts w:ascii="Times New Roman" w:hAnsi="Times New Roman" w:cs="Times New Roman"/>
+          <w:sz w:val="22"/>
+          <w:szCs w:val="22"/>
+        </w:rPr>
+      </w:pPr>
+    </w:p>
+    <w:p>
+      <w:pPr>
+        <w:spacing w:line="480" w:lineRule="auto"/>
+        <w:jc w:val="both"/>
+        <w:rPr>
+          <w:rFonts w:ascii="Times New Roman" w:hAnsi="Times New Roman" w:cs="Times New Roman"/>
+          <w:sz w:val="22"/>
+          <w:szCs w:val="22"/>
+        </w:rPr>
+      </w:pPr>
+    </w:p>
+    <w:p>
+      <w:pPr>
+        <w:spacing w:line="480" w:lineRule="auto"/>
+        <w:jc w:val="both"/>
+        <w:rPr>
+          <w:rFonts w:ascii="Times New Roman" w:hAnsi="Times New Roman" w:cs="Times New Roman"/>
+          <w:sz w:val="22"/>
+          <w:szCs w:val="22"/>
+        </w:rPr>
+      </w:pPr>
+      <w:r>
+        <w:rPr>
+          <w:rFonts w:ascii="Times New Roman" w:hAnsi="Times New Roman" w:cs="Times New Roman"/>
+          <w:sz w:val="22"/>
+          <w:szCs w:val="22"/>
+        </w:rPr>
+        <w:t xml:space="preserve">Level 1 differences, six biosynthesis </w:t>
+      </w:r>
+      <w:proofErr w:type="spellStart"/>
+      <w:r>
+        <w:rPr>
+          <w:rFonts w:ascii="Times New Roman" w:hAnsi="Times New Roman" w:cs="Times New Roman"/>
+          <w:sz w:val="22"/>
+          <w:szCs w:val="22"/>
+        </w:rPr>
+        <w:t>superpathways</w:t>
+      </w:r>
+      <w:proofErr w:type="spellEnd"/>
+      <w:r>
+        <w:rPr>
+          <w:rFonts w:ascii="Times New Roman" w:hAnsi="Times New Roman" w:cs="Times New Roman"/>
+          <w:sz w:val="22"/>
+          <w:szCs w:val="22"/>
+        </w:rPr>
+        <w:t xml:space="preserve"> for NS1, for carbohydrate, 2 for tetrapyrrole, 1 for cofactor and vitamins, one for cell structure, and one for amine/amide biosynthesis</w:t>
+      </w:r>
+    </w:p>
+    <w:p>
+      <w:pPr>
+        <w:spacing w:line="480" w:lineRule="auto"/>
+        <w:jc w:val="both"/>
+        <w:rPr>
+          <w:rFonts w:ascii="Times New Roman" w:hAnsi="Times New Roman" w:cs="Times New Roman"/>
+          <w:sz w:val="22"/>
+          <w:szCs w:val="22"/>
+        </w:rPr>
+      </w:pPr>
+      <w:r>
+        <w:rPr>
+          <w:rFonts w:ascii="Times New Roman" w:hAnsi="Times New Roman" w:cs="Times New Roman"/>
+          <w:sz w:val="22"/>
+          <w:szCs w:val="22"/>
+        </w:rPr>
+        <w:t xml:space="preserve">Another 8 for </w:t>
+      </w:r>
+      <w:proofErr w:type="spellStart"/>
+      <w:r>
+        <w:rPr>
+          <w:rFonts w:ascii="Times New Roman" w:hAnsi="Times New Roman" w:cs="Times New Roman"/>
+          <w:sz w:val="22"/>
+          <w:szCs w:val="22"/>
+        </w:rPr>
+        <w:t>superpathway</w:t>
+      </w:r>
+      <w:proofErr w:type="spellEnd"/>
+      <w:r>
+        <w:rPr>
+          <w:rFonts w:ascii="Times New Roman" w:hAnsi="Times New Roman" w:cs="Times New Roman"/>
+          <w:sz w:val="22"/>
+          <w:szCs w:val="22"/>
+        </w:rPr>
+        <w:t xml:space="preserve"> of which one is involved in </w:t>
+      </w:r>
+      <w:r>
+        <w:rPr>
+          <w:rFonts w:ascii="Times New Roman" w:hAnsi="Times New Roman" w:cs="Times New Roman"/>
+          <w:sz w:val="22"/>
+          <w:szCs w:val="22"/>
+        </w:rPr>
+        <w:t>antibiotic resistance</w:t>
+      </w:r>
+      <w:r>
+        <w:rPr>
+          <w:rFonts w:ascii="Times New Roman" w:hAnsi="Times New Roman" w:cs="Times New Roman"/>
+          <w:sz w:val="22"/>
+          <w:szCs w:val="22"/>
+        </w:rPr>
+        <w:t xml:space="preserve"> and </w:t>
+      </w:r>
+      <w:r>
+        <w:rPr>
+          <w:rFonts w:ascii="Times New Roman" w:hAnsi="Times New Roman" w:cs="Times New Roman"/>
+          <w:sz w:val="22"/>
+          <w:szCs w:val="22"/>
+        </w:rPr>
+        <w:t xml:space="preserve">7 in degradation. The seven in degradation are involved in aromatic, amide/amine (3), 2 amino </w:t>
+      </w:r>
+      <w:proofErr w:type="gramStart"/>
+      <w:r>
+        <w:rPr>
+          <w:rFonts w:ascii="Times New Roman" w:hAnsi="Times New Roman" w:cs="Times New Roman"/>
+          <w:sz w:val="22"/>
+          <w:szCs w:val="22"/>
+        </w:rPr>
+        <w:t>acid</w:t>
+      </w:r>
+      <w:proofErr w:type="gramEnd"/>
+      <w:r>
+        <w:rPr>
+          <w:rFonts w:ascii="Times New Roman" w:hAnsi="Times New Roman" w:cs="Times New Roman"/>
+          <w:sz w:val="22"/>
+          <w:szCs w:val="22"/>
+        </w:rPr>
+        <w:t xml:space="preserve">, </w:t>
+      </w:r>
+    </w:p>
+    <w:p>
+      <w:pPr>
+        <w:spacing w:line="480" w:lineRule="auto"/>
+        <w:jc w:val="both"/>
+        <w:rPr>
+          <w:rFonts w:ascii="Times New Roman" w:hAnsi="Times New Roman" w:cs="Times New Roman"/>
+          <w:sz w:val="22"/>
+          <w:szCs w:val="22"/>
+        </w:rPr>
+      </w:pPr>
+      <w:r>
+        <w:rPr>
+          <w:rFonts w:ascii="Times New Roman" w:hAnsi="Times New Roman" w:cs="Times New Roman"/>
+          <w:sz w:val="22"/>
+          <w:szCs w:val="22"/>
+        </w:rPr>
+        <w:t>Amongst the unique pathways of each NS consortium, NS1 had 1 cell structure biosynthesis (teichoic acid</w:t>
+      </w:r>
+    </w:p>
+    <w:p>
+      <w:pPr>
+        <w:spacing w:line="480" w:lineRule="auto"/>
+        <w:jc w:val="both"/>
+        <w:rPr>
+          <w:rFonts w:ascii="Times New Roman" w:hAnsi="Times New Roman" w:cs="Times New Roman"/>
+          <w:sz w:val="22"/>
+          <w:szCs w:val="22"/>
+        </w:rPr>
+      </w:pPr>
+    </w:p>
+    <w:p>
+      <w:pPr>
+        <w:spacing w:line="480" w:lineRule="auto"/>
+        <w:jc w:val="both"/>
+        <w:rPr>
+          <w:rFonts w:ascii="Times New Roman" w:hAnsi="Times New Roman" w:cs="Times New Roman"/>
+          <w:sz w:val="22"/>
+          <w:szCs w:val="22"/>
+        </w:rPr>
+      </w:pPr>
+    </w:p>
+    <w:p>
+      <w:pPr>
+        <w:spacing w:line="480" w:lineRule="auto"/>
+        <w:jc w:val="both"/>
+        <w:rPr>
+          <w:rFonts w:ascii="Times New Roman" w:hAnsi="Times New Roman" w:cs="Times New Roman"/>
+          <w:sz w:val="22"/>
+          <w:szCs w:val="22"/>
+        </w:rPr>
+      </w:pPr>
+      <w:proofErr w:type="gramStart"/>
+      <w:r>
+        <w:rPr>
+          <w:rFonts w:ascii="Times New Roman" w:hAnsi="Times New Roman" w:cs="Times New Roman"/>
+          <w:sz w:val="22"/>
+          <w:szCs w:val="22"/>
+        </w:rPr>
+        <w:t>Biosynthesis,</w:t>
+      </w:r>
+      <w:proofErr w:type="gramEnd"/>
+      <w:r>
+        <w:rPr>
+          <w:rFonts w:ascii="Times New Roman" w:hAnsi="Times New Roman" w:cs="Times New Roman"/>
+          <w:sz w:val="22"/>
+          <w:szCs w:val="22"/>
+        </w:rPr>
+        <w:t xml:space="preserve"> is about the same. A bit higher in NS1 overall</w:t>
+      </w:r>
+    </w:p>
+    <w:p>
+      <w:pPr>
+        <w:spacing w:line="480" w:lineRule="auto"/>
+        <w:jc w:val="both"/>
+        <w:rPr>
+          <w:rFonts w:ascii="Times New Roman" w:hAnsi="Times New Roman" w:cs="Times New Roman"/>
+          <w:sz w:val="22"/>
+          <w:szCs w:val="22"/>
+        </w:rPr>
+      </w:pPr>
+      <w:r>
+        <w:rPr>
+          <w:rFonts w:ascii="Times New Roman" w:hAnsi="Times New Roman" w:cs="Times New Roman"/>
+          <w:sz w:val="22"/>
+          <w:szCs w:val="22"/>
+        </w:rPr>
+        <w:t>Degradation is about the same</w:t>
+      </w:r>
+    </w:p>
+    <w:p>
+      <w:pPr>
+        <w:spacing w:line="480" w:lineRule="auto"/>
+        <w:jc w:val="both"/>
+        <w:rPr>
+          <w:rFonts w:ascii="Times New Roman" w:hAnsi="Times New Roman" w:cs="Times New Roman"/>
+          <w:sz w:val="22"/>
+          <w:szCs w:val="22"/>
+        </w:rPr>
+      </w:pPr>
+      <w:r>
+        <w:rPr>
+          <w:rFonts w:ascii="Times New Roman" w:hAnsi="Times New Roman" w:cs="Times New Roman"/>
+          <w:sz w:val="22"/>
+          <w:szCs w:val="22"/>
+        </w:rPr>
+        <w:t xml:space="preserve">Metabolic clusters </w:t>
+      </w:r>
+      <w:proofErr w:type="gramStart"/>
+      <w:r>
+        <w:rPr>
+          <w:rFonts w:ascii="Times New Roman" w:hAnsi="Times New Roman" w:cs="Times New Roman"/>
+          <w:sz w:val="22"/>
+          <w:szCs w:val="22"/>
+        </w:rPr>
+        <w:t>is</w:t>
+      </w:r>
+      <w:proofErr w:type="gramEnd"/>
+      <w:r>
+        <w:rPr>
+          <w:rFonts w:ascii="Times New Roman" w:hAnsi="Times New Roman" w:cs="Times New Roman"/>
+          <w:sz w:val="22"/>
+          <w:szCs w:val="22"/>
+        </w:rPr>
+        <w:t xml:space="preserve"> about the same</w:t>
+      </w:r>
+    </w:p>
+    <w:p>
+      <w:pPr>
+        <w:spacing w:line="480" w:lineRule="auto"/>
+        <w:jc w:val="both"/>
+        <w:rPr>
+          <w:rFonts w:ascii="Times New Roman" w:hAnsi="Times New Roman" w:cs="Times New Roman"/>
+          <w:sz w:val="22"/>
+          <w:szCs w:val="22"/>
+        </w:rPr>
+      </w:pPr>
+      <w:r>
+        <w:rPr>
+          <w:rFonts w:ascii="Times New Roman" w:hAnsi="Times New Roman" w:cs="Times New Roman"/>
+          <w:sz w:val="22"/>
+          <w:szCs w:val="22"/>
+        </w:rPr>
+        <w:t>One more in detoxification for NS6</w:t>
+      </w:r>
+    </w:p>
+    <w:p>
+      <w:pPr>
+        <w:spacing w:line="480" w:lineRule="auto"/>
+        <w:jc w:val="both"/>
+        <w:rPr>
+          <w:rFonts w:ascii="Times New Roman" w:hAnsi="Times New Roman" w:cs="Times New Roman"/>
+          <w:sz w:val="22"/>
+          <w:szCs w:val="22"/>
+        </w:rPr>
+      </w:pPr>
+      <w:r>
+        <w:rPr>
+          <w:rFonts w:ascii="Times New Roman" w:hAnsi="Times New Roman" w:cs="Times New Roman"/>
+          <w:sz w:val="22"/>
+          <w:szCs w:val="22"/>
+        </w:rPr>
+        <w:t>Carbohydrate biosynthesis has one more in NS1 and not NS6, that extra one has a value near 7 Log2FC.</w:t>
+      </w:r>
+    </w:p>
+    <w:p>
+      <w:pPr>
+        <w:spacing w:line="480" w:lineRule="auto"/>
+        <w:jc w:val="both"/>
+        <w:rPr>
+          <w:rFonts w:ascii="Times New Roman" w:hAnsi="Times New Roman" w:cs="Times New Roman"/>
+          <w:sz w:val="22"/>
+          <w:szCs w:val="22"/>
+        </w:rPr>
+      </w:pPr>
+      <w:r>
+        <w:rPr>
+          <w:rFonts w:ascii="Times New Roman" w:hAnsi="Times New Roman" w:cs="Times New Roman"/>
+          <w:sz w:val="22"/>
+          <w:szCs w:val="22"/>
+        </w:rPr>
+        <w:t>C1 compound utilization and assimilation higher by 1 in NS1</w:t>
+      </w:r>
+    </w:p>
+    <w:p>
+      <w:pPr>
+        <w:spacing w:line="480" w:lineRule="auto"/>
+        <w:jc w:val="both"/>
+        <w:rPr>
+          <w:rFonts w:ascii="Times New Roman" w:hAnsi="Times New Roman" w:cs="Times New Roman"/>
+          <w:sz w:val="22"/>
+          <w:szCs w:val="22"/>
+        </w:rPr>
+      </w:pPr>
+      <w:r>
+        <w:rPr>
+          <w:rFonts w:ascii="Times New Roman" w:hAnsi="Times New Roman" w:cs="Times New Roman"/>
+          <w:sz w:val="22"/>
+          <w:szCs w:val="22"/>
+        </w:rPr>
+        <w:t>Inorganic nutrient metabolism in NS6 but not NS1</w:t>
+      </w:r>
+    </w:p>
+    <w:p>
+      <w:pPr>
+        <w:spacing w:line="480" w:lineRule="auto"/>
+        <w:jc w:val="both"/>
+        <w:rPr>
+          <w:rFonts w:ascii="Times New Roman" w:hAnsi="Times New Roman" w:cs="Times New Roman"/>
+          <w:sz w:val="22"/>
+          <w:szCs w:val="22"/>
+        </w:rPr>
+      </w:pPr>
+      <w:r>
+        <w:rPr>
+          <w:rFonts w:ascii="Times New Roman" w:hAnsi="Times New Roman" w:cs="Times New Roman"/>
+          <w:sz w:val="22"/>
+          <w:szCs w:val="22"/>
+        </w:rPr>
+        <w:t xml:space="preserve">Nucleoside and nucleotide degradation </w:t>
+      </w:r>
+      <w:proofErr w:type="gramStart"/>
+      <w:r>
+        <w:rPr>
+          <w:rFonts w:ascii="Times New Roman" w:hAnsi="Times New Roman" w:cs="Times New Roman"/>
+          <w:sz w:val="22"/>
+          <w:szCs w:val="22"/>
+        </w:rPr>
+        <w:t>not present</w:t>
+      </w:r>
+      <w:proofErr w:type="gramEnd"/>
+      <w:r>
+        <w:rPr>
+          <w:rFonts w:ascii="Times New Roman" w:hAnsi="Times New Roman" w:cs="Times New Roman"/>
+          <w:sz w:val="22"/>
+          <w:szCs w:val="22"/>
+        </w:rPr>
+        <w:t xml:space="preserve"> in NS1 but yes in NS6</w:t>
+      </w:r>
+    </w:p>
+    <w:p>
+      <w:pPr>
+        <w:spacing w:line="480" w:lineRule="auto"/>
+        <w:jc w:val="both"/>
+        <w:rPr>
+          <w:rFonts w:ascii="Times New Roman" w:hAnsi="Times New Roman" w:cs="Times New Roman"/>
+          <w:sz w:val="22"/>
+          <w:szCs w:val="22"/>
+        </w:rPr>
+      </w:pPr>
+      <w:r>
+        <w:rPr>
+          <w:rFonts w:ascii="Times New Roman" w:hAnsi="Times New Roman" w:cs="Times New Roman"/>
+          <w:sz w:val="22"/>
+          <w:szCs w:val="22"/>
+        </w:rPr>
+        <w:lastRenderedPageBreak/>
+        <w:t>Cofactor carrier and biosynthesis higher in NS1 by 3? Pathways</w:t>
+      </w:r>
+    </w:p>
+    <w:p>
+      <w:pPr>
+        <w:spacing w:line="480" w:lineRule="auto"/>
+        <w:jc w:val="both"/>
+        <w:rPr>
+          <w:rFonts w:ascii="Times New Roman" w:hAnsi="Times New Roman" w:cs="Times New Roman"/>
+          <w:sz w:val="22"/>
+          <w:szCs w:val="22"/>
+        </w:rPr>
+      </w:pPr>
+      <w:r>
+        <w:rPr>
+          <w:rFonts w:ascii="Times New Roman" w:hAnsi="Times New Roman" w:cs="Times New Roman"/>
+          <w:sz w:val="22"/>
+          <w:szCs w:val="22"/>
+        </w:rPr>
+        <w:t>Aromatic compound degradation about the same</w:t>
+      </w:r>
+    </w:p>
+    <w:p>
+      <w:pPr>
+        <w:spacing w:line="480" w:lineRule="auto"/>
+        <w:jc w:val="both"/>
+        <w:rPr>
+          <w:rFonts w:ascii="Times New Roman" w:hAnsi="Times New Roman" w:cs="Times New Roman"/>
+          <w:sz w:val="22"/>
+          <w:szCs w:val="22"/>
+        </w:rPr>
+      </w:pPr>
+      <w:r>
+        <w:rPr>
+          <w:rFonts w:ascii="Times New Roman" w:hAnsi="Times New Roman" w:cs="Times New Roman"/>
+          <w:sz w:val="22"/>
+          <w:szCs w:val="22"/>
+        </w:rPr>
+        <w:t>None in carbohydrate degradation for NS6</w:t>
+      </w:r>
+    </w:p>
+    <w:p>
+      <w:pPr>
+        <w:spacing w:line="480" w:lineRule="auto"/>
+        <w:jc w:val="both"/>
+        <w:rPr>
+          <w:rFonts w:ascii="Times New Roman" w:hAnsi="Times New Roman" w:cs="Times New Roman"/>
+          <w:sz w:val="22"/>
+          <w:szCs w:val="22"/>
+        </w:rPr>
+      </w:pPr>
+    </w:p>
+    <w:p>
+      <w:pPr>
+        <w:spacing w:line="480" w:lineRule="auto"/>
+        <w:jc w:val="both"/>
+        <w:rPr>
+          <w:rFonts w:ascii="Times New Roman" w:hAnsi="Times New Roman" w:cs="Times New Roman"/>
+          <w:sz w:val="22"/>
+          <w:szCs w:val="22"/>
+        </w:rPr>
+      </w:pPr>
+      <w:r>
+        <w:rPr>
+          <w:rFonts w:ascii="Times New Roman" w:hAnsi="Times New Roman" w:cs="Times New Roman"/>
+          <w:noProof/>
+          <w:sz w:val="22"/>
+          <w:szCs w:val="22"/>
+        </w:rPr>
+        <w:drawing>
+          <wp:inline distT="0" distB="0" distL="0" distR="0" wp14:anchorId="2249BFDF" wp14:editId="1C2C910C">
+            <wp:extent cx="2108200" cy="2108200"/>
+            <wp:effectExtent l="0" t="0" r="0" b="0"/>
+            <wp:docPr id="411248680" name="Picture 17"/>
+            <wp:cNvGraphicFramePr>
+              <a:graphicFrameLocks xmlns:a="http://schemas.openxmlformats.org/drawingml/2006/main" noChangeAspect="1"/>
+            </wp:cNvGraphicFramePr>
+            <a:graphic xmlns:a="http://schemas.openxmlformats.org/drawingml/2006/main">
+              <a:graphicData uri="http://schemas.openxmlformats.org/drawingml/2006/picture">
+                <pic:pic xmlns:pic="http://schemas.openxmlformats.org/drawingml/2006/picture">
+                  <pic:nvPicPr>
+                    <pic:cNvPr id="411248680" name="Picture 411248680"/>
+                    <pic:cNvPicPr/>
+                  </pic:nvPicPr>
+                  <pic:blipFill>
+                    <a:blip r:embed="rId4" cstate="print">
+                      <a:extLst>
+                        <a:ext uri="{28A0092B-C50C-407E-A947-70E740481C1C}">
+                          <a14:useLocalDpi xmlns:a14="http://schemas.microsoft.com/office/drawing/2010/main" val="0"/>
+                        </a:ext>
+                      </a:extLst>
+                    </a:blip>
+                    <a:stretch>
+                      <a:fillRect/>
+                    </a:stretch>
+                  </pic:blipFill>
+                  <pic:spPr>
+                    <a:xfrm>
+                      <a:off x="0" y="0"/>
+                      <a:ext cx="2126946" cy="2126946"/>
+                    </a:xfrm>
+                    <a:prstGeom prst="rect">
+                      <a:avLst/>
+                    </a:prstGeom>
+                  </pic:spPr>
+                </pic:pic>
+              </a:graphicData>
+            </a:graphic>
+          </wp:inline>
+        </w:drawing>
+      </w:r>
+      <w:r>
+        <w:rPr>
+          <w:rFonts w:ascii="Times New Roman" w:hAnsi="Times New Roman" w:cs="Times New Roman"/>
+          <w:sz w:val="22"/>
+          <w:szCs w:val="22"/>
+        </w:rPr>
+        <w:tab/>
+      </w:r>
+      <w:r>
+        <w:rPr>
+          <w:rFonts w:ascii="Times New Roman" w:hAnsi="Times New Roman" w:cs="Times New Roman"/>
+          <w:sz w:val="22"/>
+          <w:szCs w:val="22"/>
+        </w:rPr>
+        <w:tab/>
+      </w:r>
+      <w:r>
+        <w:rPr>
+          <w:rFonts w:ascii="Times New Roman" w:hAnsi="Times New Roman" w:cs="Times New Roman"/>
+          <w:sz w:val="22"/>
+          <w:szCs w:val="22"/>
+        </w:rPr>
+        <w:tab/>
+      </w:r>
+      <w:r>
+        <w:rPr>
+          <w:rFonts w:ascii="Times New Roman" w:hAnsi="Times New Roman" w:cs="Times New Roman"/>
+          <w:noProof/>
+          <w:sz w:val="22"/>
+          <w:szCs w:val="22"/>
+        </w:rPr>
+        <w:drawing>
+          <wp:inline distT="0" distB="0" distL="0" distR="0" wp14:anchorId="0CBA4D6F" wp14:editId="200F3622">
+            <wp:extent cx="2108200" cy="2108200"/>
+            <wp:effectExtent l="0" t="0" r="0" b="0"/>
+            <wp:docPr id="1270970180" name="Picture 19"/>
+            <wp:cNvGraphicFramePr>
+              <a:graphicFrameLocks xmlns:a="http://schemas.openxmlformats.org/drawingml/2006/main" noChangeAspect="1"/>
+            </wp:cNvGraphicFramePr>
+            <a:graphic xmlns:a="http://schemas.openxmlformats.org/drawingml/2006/main">
+              <a:graphicData uri="http://schemas.openxmlformats.org/drawingml/2006/picture">
+                <pic:pic xmlns:pic="http://schemas.openxmlformats.org/drawingml/2006/picture">
+                  <pic:nvPicPr>
+                    <pic:cNvPr id="1270970180" name="Picture 1270970180"/>
+                    <pic:cNvPicPr/>
+                  </pic:nvPicPr>
+                  <pic:blipFill>
+                    <a:blip r:embed="rId5" cstate="print">
+                      <a:extLst>
+                        <a:ext uri="{28A0092B-C50C-407E-A947-70E740481C1C}">
+                          <a14:useLocalDpi xmlns:a14="http://schemas.microsoft.com/office/drawing/2010/main" val="0"/>
+                        </a:ext>
+                      </a:extLst>
+                    </a:blip>
+                    <a:stretch>
+                      <a:fillRect/>
+                    </a:stretch>
+                  </pic:blipFill>
+                  <pic:spPr>
+                    <a:xfrm>
+                      <a:off x="0" y="0"/>
+                      <a:ext cx="2110219" cy="2110219"/>
+                    </a:xfrm>
+                    <a:prstGeom prst="rect">
+                      <a:avLst/>
+                    </a:prstGeom>
+                  </pic:spPr>
+                </pic:pic>
+              </a:graphicData>
+            </a:graphic>
+          </wp:inline>
+        </w:drawing>
+      </w:r>
+    </w:p>
+    <w:p>
+      <w:pPr>
+        <w:spacing w:line="480" w:lineRule="auto"/>
+        <w:jc w:val="both"/>
+        <w:rPr>
+          <w:rFonts w:ascii="Times New Roman" w:hAnsi="Times New Roman" w:cs="Times New Roman"/>
+          <w:sz w:val="22"/>
+          <w:szCs w:val="22"/>
+        </w:rPr>
+      </w:pPr>
+      <w:r>
+        <w:rPr>
+          <w:rFonts w:ascii="Times New Roman" w:hAnsi="Times New Roman" w:cs="Times New Roman"/>
+          <w:b/>
+          <w:bCs/>
+          <w:sz w:val="22"/>
+          <w:szCs w:val="22"/>
+        </w:rPr>
+        <w:t xml:space="preserve">Supplementary figure x. </w:t>
+      </w:r>
+      <w:r>
+        <w:rPr>
+          <w:rFonts w:ascii="Times New Roman" w:hAnsi="Times New Roman" w:cs="Times New Roman"/>
+          <w:sz w:val="22"/>
+          <w:szCs w:val="22"/>
+        </w:rPr>
+        <w:t>Venn diagram</w:t>
+      </w:r>
+      <w:r>
+        <w:rPr>
+          <w:rFonts w:ascii="Times New Roman" w:hAnsi="Times New Roman" w:cs="Times New Roman"/>
+          <w:sz w:val="22"/>
+          <w:szCs w:val="22"/>
+        </w:rPr>
+        <w:t>s</w:t>
+      </w:r>
+      <w:r>
+        <w:rPr>
+          <w:rFonts w:ascii="Times New Roman" w:hAnsi="Times New Roman" w:cs="Times New Roman"/>
+          <w:sz w:val="22"/>
+          <w:szCs w:val="22"/>
+        </w:rPr>
+        <w:t xml:space="preserve"> showing the number and percentage</w:t>
+      </w:r>
+      <w:r>
+        <w:rPr>
+          <w:rFonts w:ascii="Times New Roman" w:hAnsi="Times New Roman" w:cs="Times New Roman"/>
+          <w:sz w:val="22"/>
+          <w:szCs w:val="22"/>
+        </w:rPr>
+        <w:t>s</w:t>
+      </w:r>
+      <w:r>
+        <w:rPr>
+          <w:rFonts w:ascii="Times New Roman" w:hAnsi="Times New Roman" w:cs="Times New Roman"/>
+          <w:sz w:val="22"/>
+          <w:szCs w:val="22"/>
+        </w:rPr>
+        <w:t xml:space="preserve"> of</w:t>
+      </w:r>
+      <w:r>
+        <w:rPr>
+          <w:rFonts w:ascii="Times New Roman" w:hAnsi="Times New Roman" w:cs="Times New Roman"/>
+          <w:sz w:val="22"/>
+          <w:szCs w:val="22"/>
+        </w:rPr>
+        <w:t xml:space="preserve"> significantly enriched pathways of NS1 when doing a pairwise comparison of NS1 vs S2 at weeks 9 and 10 vs the significantly enriched pathways of NS6 when doing a pairwise comparison of NS6 vs S5 at weeks 9 and 10. (b) Venn diagrams showing the number and percentages of significantly enriched pathways of S2 when doing a pairwise comparison of NS1 vs S2 at weeks 9 and 10, vs the significantly enriched pathways of S5 when doing a pairwise comparison of NS6 vs S5 at weeks 9 and 10. </w:t>
+      </w:r>
+    </w:p>
+    <w:p>
+      <w:pPr>
+        <w:spacing w:line="480" w:lineRule="auto"/>
+        <w:jc w:val="both"/>
+        <w:rPr>
+          <w:rFonts w:ascii="Times New Roman" w:hAnsi="Times New Roman" w:cs="Times New Roman"/>
           <w:sz w:val="18"/>
           <w:szCs w:val="18"/>
         </w:rPr>
@@ -181,6 +1143,7 @@
           <w:sz w:val="22"/>
           <w:szCs w:val="22"/>
         </w:rPr>
+        <w:lastRenderedPageBreak/>
         <w:t>Two independent approaches for NGS sequencing were carried out: bacterial whole-genome sequencing (WGS) and 16S rRNA v3v4 amplicon sequencing. For WGS, b</w:t>
       </w:r>
       <w:r>
@@ -485,7 +1448,6 @@
           <w:sz w:val="22"/>
           <w:szCs w:val="22"/>
         </w:rPr>
-        <w:lastRenderedPageBreak/>
         <w:t xml:space="preserve">The WGS samples of bacterial strains were sequenced using an Illumina </w:t>
       </w:r>
       <w:proofErr w:type="spellStart"/>
@@ -770,6 +1732,7 @@
           <w:sz w:val="22"/>
           <w:szCs w:val="22"/>
         </w:rPr>
+        <w:lastRenderedPageBreak/>
         <w:t>GATCGGAAGAGCACACGTCTGAACTCCAGTCAC</w:t>
       </w:r>
       <w:r>
@@ -1414,16 +2377,7 @@
           <w:sz w:val="22"/>
           <w:szCs w:val="22"/>
         </w:rPr>
-        <w:t xml:space="preserve"> --file &lt;input genome assembly file&gt; &lt;output </w:t>
-      </w:r>
-      <w:r>
-        <w:rPr>
-          <w:rFonts w:ascii="Times New Roman" w:hAnsi="Times New Roman" w:cs="Times New Roman"/>
-          <w:sz w:val="22"/>
-          <w:szCs w:val="22"/>
-        </w:rPr>
-        <w:lastRenderedPageBreak/>
-        <w:t>file&gt;).</w:t>
+        <w:t xml:space="preserve"> --file &lt;input genome assembly file&gt; &lt;output file&gt;).</w:t>
       </w:r>
       <w:r>
         <w:rPr>
@@ -2049,6 +3003,7 @@
           <w:sz w:val="22"/>
           <w:szCs w:val="22"/>
         </w:rPr>
+        <w:lastRenderedPageBreak/>
         <w:t xml:space="preserve">Genomic and </w:t>
       </w:r>
       <w:proofErr w:type="spellStart"/>
@@ -2220,16 +3175,7 @@
           <w:sz w:val="22"/>
           <w:szCs w:val="22"/>
         </w:rPr>
-        <w:t xml:space="preserve">Due to the nature of short-read genome assembly and its limitation to distinguish different copy numbers of the same gene, 16S rRNA gene copy numbers were estimated using the Integrated Microbial Genomes (IMG) rrnDB-v5.1 database. </w:t>
-      </w:r>
-      <w:r>
-        <w:rPr>
-          <w:rFonts w:ascii="Times New Roman" w:hAnsi="Times New Roman" w:cs="Times New Roman"/>
-          <w:sz w:val="22"/>
-          <w:szCs w:val="22"/>
-        </w:rPr>
-        <w:lastRenderedPageBreak/>
-        <w:t>Using a custom script (16S_CNV_IMG.py), the median 16S rRNA gene copy number was calculated per strain. When copy number data were unavailable, values from its closest sister taxon were used as a proxy.</w:t>
+        <w:t>Due to the nature of short-read genome assembly and its limitation to distinguish different copy numbers of the same gene, 16S rRNA gene copy numbers were estimated using the Integrated Microbial Genomes (IMG) rrnDB-v5.1 database. Using a custom script (16S_CNV_IMG.py), the median 16S rRNA gene copy number was calculated per strain. When copy number data were unavailable, values from its closest sister taxon were used as a proxy.</w:t>
       </w:r>
     </w:p>
     <w:p>
@@ -2620,6 +3566,7 @@
           <w:sz w:val="22"/>
           <w:szCs w:val="22"/>
         </w:rPr>
+        <w:lastRenderedPageBreak/>
         <w:t>Taxonomy assignment was performed</w:t>
       </w:r>
       <w:r>
@@ -2762,7 +3709,6 @@
           <w:sz w:val="22"/>
           <w:szCs w:val="22"/>
         </w:rPr>
-        <w:lastRenderedPageBreak/>
         <w:t xml:space="preserve"> In the event of </w:t>
       </w:r>
       <w:r>
@@ -2957,6 +3903,7 @@
           <w:sz w:val="22"/>
           <w:szCs w:val="22"/>
         </w:rPr>
+        <w:lastRenderedPageBreak/>
         <w:t>_</w:t>
       </w:r>
       <w:proofErr w:type="spellStart"/>
@@ -3563,16 +4510,7 @@
           <w:sz w:val="22"/>
           <w:szCs w:val="22"/>
         </w:rPr>
-        <w:t xml:space="preserve"> </w:t>
-      </w:r>
-      <w:r>
-        <w:rPr>
-          <w:rFonts w:ascii="Times New Roman" w:hAnsi="Times New Roman" w:cs="Times New Roman"/>
-          <w:sz w:val="22"/>
-          <w:szCs w:val="22"/>
-        </w:rPr>
-        <w:lastRenderedPageBreak/>
-        <w:t>&lt;</w:t>
+        <w:t xml:space="preserve"> &lt;</w:t>
       </w:r>
       <w:proofErr w:type="spellStart"/>
       <w:r>
@@ -4027,6 +4965,7 @@
           <w:sz w:val="22"/>
           <w:szCs w:val="22"/>
         </w:rPr>
+        <w:lastRenderedPageBreak/>
         <w:t>Data analysis</w:t>
       </w:r>
     </w:p>
@@ -4108,25 +5047,589 @@
     </w:p>
     <w:p>
       <w:pPr>
-        <w:spacing w:line="480" w:lineRule="auto"/>
-        <w:jc w:val="both"/>
-        <w:rPr>
-          <w:rFonts w:ascii="Times New Roman" w:hAnsi="Times New Roman" w:cs="Times New Roman"/>
+        <w:pStyle w:val="NormalWeb"/>
+      </w:pPr>
+      <w:proofErr w:type="spellStart"/>
+      <w:r>
+        <w:t>bifido</w:t>
+      </w:r>
+      <w:proofErr w:type="spellEnd"/>
+      <w:r>
+        <w:t xml:space="preserve"> longum</w:t>
+      </w:r>
+    </w:p>
+    <w:p>
+      <w:pPr>
+        <w:pStyle w:val="NormalWeb"/>
+      </w:pPr>
+      <w:proofErr w:type="spellStart"/>
+      <w:r>
+        <w:t>collinsella</w:t>
+      </w:r>
+      <w:proofErr w:type="spellEnd"/>
+      <w:r>
+        <w:t xml:space="preserve"> sp1, sp2</w:t>
+      </w:r>
+    </w:p>
+    <w:p>
+      <w:pPr>
+        <w:pStyle w:val="NormalWeb"/>
+      </w:pPr>
+      <w:proofErr w:type="spellStart"/>
+      <w:r>
+        <w:t>eggerthella</w:t>
+      </w:r>
+      <w:proofErr w:type="spellEnd"/>
+      <w:r>
+        <w:t xml:space="preserve"> lenta</w:t>
+      </w:r>
+    </w:p>
+    <w:p>
+      <w:pPr>
+        <w:pStyle w:val="NormalWeb"/>
+      </w:pPr>
+      <w:proofErr w:type="spellStart"/>
+      <w:r>
+        <w:t>eisenbergiella</w:t>
+      </w:r>
+      <w:proofErr w:type="spellEnd"/>
+      <w:r>
+        <w:t xml:space="preserve"> </w:t>
+      </w:r>
+      <w:proofErr w:type="spellStart"/>
+      <w:r>
+        <w:t>tayi</w:t>
+      </w:r>
+      <w:proofErr w:type="spellEnd"/>
+    </w:p>
+    <w:p>
+      <w:pPr>
+        <w:pStyle w:val="NormalWeb"/>
+      </w:pPr>
+      <w:proofErr w:type="spellStart"/>
+      <w:r>
+        <w:t>enterocloster</w:t>
+      </w:r>
+      <w:proofErr w:type="spellEnd"/>
+      <w:r>
+        <w:t xml:space="preserve"> </w:t>
+      </w:r>
+      <w:proofErr w:type="spellStart"/>
+      <w:r>
+        <w:t>bolteae</w:t>
+      </w:r>
+      <w:proofErr w:type="spellEnd"/>
+      <w:r>
+        <w:t>/</w:t>
+      </w:r>
+    </w:p>
+    <w:p>
+      <w:pPr>
+        <w:pStyle w:val="NormalWeb"/>
+      </w:pPr>
+      <w:r>
+        <w:t>e. coli</w:t>
+      </w:r>
+    </w:p>
+    <w:p>
+      <w:pPr>
+        <w:pStyle w:val="NormalWeb"/>
+      </w:pPr>
+      <w:r>
+        <w:t xml:space="preserve">f. </w:t>
+      </w:r>
+      <w:proofErr w:type="spellStart"/>
+      <w:r>
+        <w:t>plautii</w:t>
+      </w:r>
+      <w:proofErr w:type="spellEnd"/>
+    </w:p>
+    <w:p>
+      <w:pPr>
+        <w:pStyle w:val="NormalWeb"/>
+      </w:pPr>
+    </w:p>
+    <w:p>
+      <w:pPr>
+        <w:pStyle w:val="NormalWeb"/>
+      </w:pPr>
+      <w:r>
+        <w:t>First, create a file that has the ID of the genomes of interest, and the path to the database of the assembled genome:</w:t>
+      </w:r>
+    </w:p>
+    <w:p>
+      <w:pPr>
+        <w:pStyle w:val="NormalWeb"/>
+      </w:pPr>
+    </w:p>
+    <w:p>
+      <w:pPr>
+        <w:pStyle w:val="NormalWeb"/>
+      </w:pPr>
+      <w:r>
+        <w:t>Then, generate a genome storage database:</w:t>
+      </w:r>
+    </w:p>
+    <w:p>
+      <w:pPr>
+        <w:pStyle w:val="NormalWeb"/>
+      </w:pPr>
+    </w:p>
+    <w:p>
+      <w:pPr>
+        <w:pStyle w:val="NormalWeb"/>
+      </w:pPr>
+      <w:r>
+        <w:t>Then generate the pangenome analysis:</w:t>
+      </w:r>
+    </w:p>
+    <w:p>
+      <w:pPr>
+        <w:tabs>
+          <w:tab w:val="left" w:pos="560"/>
+          <w:tab w:val="left" w:pos="1120"/>
+          <w:tab w:val="left" w:pos="1680"/>
+          <w:tab w:val="left" w:pos="2240"/>
+          <w:tab w:val="left" w:pos="2800"/>
+          <w:tab w:val="left" w:pos="3360"/>
+          <w:tab w:val="left" w:pos="3920"/>
+          <w:tab w:val="left" w:pos="4480"/>
+          <w:tab w:val="left" w:pos="5040"/>
+          <w:tab w:val="left" w:pos="5600"/>
+          <w:tab w:val="left" w:pos="6160"/>
+          <w:tab w:val="left" w:pos="6720"/>
+        </w:tabs>
+        <w:autoSpaceDE w:val="0"/>
+        <w:autoSpaceDN w:val="0"/>
+        <w:adjustRightInd w:val="0"/>
+        <w:spacing w:after="0" w:line="240" w:lineRule="auto"/>
+        <w:rPr>
+          <w:rFonts w:ascii="Menlo" w:hAnsi="Menlo" w:cs="Menlo"/>
+          <w:color w:val="000000" w:themeColor="text1"/>
+          <w:kern w:val="0"/>
+          <w:sz w:val="30"/>
+          <w:szCs w:val="30"/>
+          <w:lang w:val="en-US"/>
+        </w:rPr>
+      </w:pPr>
+      <w:proofErr w:type="spellStart"/>
+      <w:r>
+        <w:rPr>
+          <w:rFonts w:ascii="Menlo" w:hAnsi="Menlo" w:cs="Menlo"/>
+          <w:color w:val="000000" w:themeColor="text1"/>
+          <w:kern w:val="0"/>
+          <w:sz w:val="30"/>
+          <w:szCs w:val="30"/>
+          <w:lang w:val="en-US"/>
+        </w:rPr>
+        <w:t>anvi</w:t>
+      </w:r>
+      <w:proofErr w:type="spellEnd"/>
+      <w:r>
+        <w:rPr>
+          <w:rFonts w:ascii="Menlo" w:hAnsi="Menlo" w:cs="Menlo"/>
+          <w:color w:val="000000" w:themeColor="text1"/>
+          <w:kern w:val="0"/>
+          <w:sz w:val="30"/>
+          <w:szCs w:val="30"/>
+          <w:lang w:val="en-US"/>
+        </w:rPr>
+        <w:t xml:space="preserve">-pan-genome -g </w:t>
+      </w:r>
+      <w:proofErr w:type="spellStart"/>
+      <w:r>
+        <w:rPr>
+          <w:rFonts w:ascii="Menlo" w:hAnsi="Menlo" w:cs="Menlo"/>
+          <w:color w:val="000000" w:themeColor="text1"/>
+          <w:kern w:val="0"/>
+          <w:sz w:val="30"/>
+          <w:szCs w:val="30"/>
+          <w:lang w:val="en-US"/>
+        </w:rPr>
+        <w:t>COLLINSELLA_GENOMES.db</w:t>
+      </w:r>
+      <w:proofErr w:type="spellEnd"/>
+      <w:r>
+        <w:rPr>
+          <w:rFonts w:ascii="Menlo" w:hAnsi="Menlo" w:cs="Menlo"/>
+          <w:color w:val="000000" w:themeColor="text1"/>
+          <w:kern w:val="0"/>
+          <w:sz w:val="30"/>
+          <w:szCs w:val="30"/>
+          <w:lang w:val="en-US"/>
+        </w:rPr>
+        <w:t xml:space="preserve"> --project-name "</w:t>
+      </w:r>
+      <w:proofErr w:type="spellStart"/>
+      <w:r>
+        <w:rPr>
+          <w:rFonts w:ascii="Menlo" w:hAnsi="Menlo" w:cs="Menlo"/>
+          <w:color w:val="000000" w:themeColor="text1"/>
+          <w:kern w:val="0"/>
+          <w:sz w:val="30"/>
+          <w:szCs w:val="30"/>
+          <w:lang w:val="en-US"/>
+        </w:rPr>
+        <w:t>Collinsella_Pangenomes</w:t>
+      </w:r>
+      <w:proofErr w:type="spellEnd"/>
+      <w:r>
+        <w:rPr>
+          <w:rFonts w:ascii="Menlo" w:hAnsi="Menlo" w:cs="Menlo"/>
+          <w:color w:val="000000" w:themeColor="text1"/>
+          <w:kern w:val="0"/>
+          <w:sz w:val="30"/>
+          <w:szCs w:val="30"/>
+          <w:lang w:val="en-US"/>
+        </w:rPr>
+        <w:t xml:space="preserve">" -o </w:t>
+      </w:r>
+      <w:proofErr w:type="spellStart"/>
+      <w:r>
+        <w:rPr>
+          <w:rFonts w:ascii="Menlo" w:hAnsi="Menlo" w:cs="Menlo"/>
+          <w:color w:val="000000" w:themeColor="text1"/>
+          <w:kern w:val="0"/>
+          <w:sz w:val="30"/>
+          <w:szCs w:val="30"/>
+          <w:lang w:val="en-US"/>
+        </w:rPr>
+        <w:t>Collinsella-PAN.db</w:t>
+      </w:r>
+      <w:proofErr w:type="spellEnd"/>
+      <w:r>
+        <w:rPr>
+          <w:rFonts w:ascii="Menlo" w:hAnsi="Menlo" w:cs="Menlo"/>
+          <w:color w:val="000000" w:themeColor="text1"/>
+          <w:kern w:val="0"/>
+          <w:sz w:val="30"/>
+          <w:szCs w:val="30"/>
+          <w:lang w:val="en-US"/>
+        </w:rPr>
+        <w:t xml:space="preserve"> --num-threads 32 --</w:t>
+      </w:r>
+      <w:proofErr w:type="spellStart"/>
+      <w:r>
+        <w:rPr>
+          <w:rFonts w:ascii="Menlo" w:hAnsi="Menlo" w:cs="Menlo"/>
+          <w:color w:val="000000" w:themeColor="text1"/>
+          <w:kern w:val="0"/>
+          <w:sz w:val="30"/>
+          <w:szCs w:val="30"/>
+          <w:lang w:val="en-US"/>
+        </w:rPr>
+        <w:t>minbit</w:t>
+      </w:r>
+      <w:proofErr w:type="spellEnd"/>
+      <w:r>
+        <w:rPr>
+          <w:rFonts w:ascii="Menlo" w:hAnsi="Menlo" w:cs="Menlo"/>
+          <w:color w:val="000000" w:themeColor="text1"/>
+          <w:kern w:val="0"/>
+          <w:sz w:val="30"/>
+          <w:szCs w:val="30"/>
+          <w:lang w:val="en-US"/>
+        </w:rPr>
+        <w:t xml:space="preserve"> 0.5 --mcl-inflation 10 --use-</w:t>
+      </w:r>
+      <w:proofErr w:type="spellStart"/>
+      <w:r>
+        <w:rPr>
+          <w:rFonts w:ascii="Menlo" w:hAnsi="Menlo" w:cs="Menlo"/>
+          <w:color w:val="000000" w:themeColor="text1"/>
+          <w:kern w:val="0"/>
+          <w:sz w:val="30"/>
+          <w:szCs w:val="30"/>
+          <w:lang w:val="en-US"/>
+        </w:rPr>
+        <w:t>ncbi</w:t>
+      </w:r>
+      <w:proofErr w:type="spellEnd"/>
+      <w:r>
+        <w:rPr>
+          <w:rFonts w:ascii="Menlo" w:hAnsi="Menlo" w:cs="Menlo"/>
+          <w:color w:val="000000" w:themeColor="text1"/>
+          <w:kern w:val="0"/>
+          <w:sz w:val="30"/>
+          <w:szCs w:val="30"/>
+          <w:lang w:val="en-US"/>
+        </w:rPr>
+        <w:t>-blast</w:t>
+      </w:r>
+    </w:p>
+    <w:p>
+      <w:pPr>
+        <w:spacing w:line="480" w:lineRule="auto"/>
+        <w:jc w:val="both"/>
+        <w:rPr>
+          <w:rFonts w:ascii="Times New Roman" w:hAnsi="Times New Roman" w:cs="Times New Roman"/>
+          <w:color w:val="000000" w:themeColor="text1"/>
           <w:sz w:val="18"/>
           <w:szCs w:val="18"/>
-        </w:rPr>
-      </w:pPr>
-    </w:p>
-    <w:p>
-      <w:pPr>
-        <w:spacing w:line="480" w:lineRule="auto"/>
-        <w:jc w:val="both"/>
-        <w:rPr>
-          <w:rFonts w:ascii="Times New Roman" w:hAnsi="Times New Roman" w:cs="Times New Roman"/>
+          <w:lang w:val="en-US"/>
+        </w:rPr>
+      </w:pPr>
+    </w:p>
+    <w:p>
+      <w:pPr>
+        <w:spacing w:line="480" w:lineRule="auto"/>
+        <w:jc w:val="both"/>
+        <w:rPr>
+          <w:rFonts w:ascii="Times New Roman" w:hAnsi="Times New Roman" w:cs="Times New Roman"/>
+          <w:color w:val="000000" w:themeColor="text1"/>
           <w:sz w:val="18"/>
           <w:szCs w:val="18"/>
-        </w:rPr>
-      </w:pPr>
+          <w:lang w:val="en-US"/>
+        </w:rPr>
+      </w:pPr>
+      <w:r>
+        <w:rPr>
+          <w:rFonts w:ascii="Times New Roman" w:hAnsi="Times New Roman" w:cs="Times New Roman"/>
+          <w:color w:val="000000" w:themeColor="text1"/>
+          <w:sz w:val="18"/>
+          <w:szCs w:val="18"/>
+          <w:lang w:val="en-US"/>
+        </w:rPr>
+        <w:lastRenderedPageBreak/>
+        <w:t>Finally:</w:t>
+      </w:r>
+    </w:p>
+    <w:p>
+      <w:pPr>
+        <w:spacing w:line="480" w:lineRule="auto"/>
+        <w:jc w:val="both"/>
+        <w:rPr>
+          <w:rFonts w:ascii="Menlo" w:hAnsi="Menlo" w:cs="Menlo"/>
+          <w:color w:val="000000" w:themeColor="text1"/>
+          <w:kern w:val="0"/>
+          <w:sz w:val="30"/>
+          <w:szCs w:val="30"/>
+          <w:lang w:val="en-US"/>
+        </w:rPr>
+      </w:pPr>
+      <w:proofErr w:type="spellStart"/>
+      <w:r>
+        <w:rPr>
+          <w:rFonts w:ascii="Menlo" w:hAnsi="Menlo" w:cs="Menlo"/>
+          <w:color w:val="000000" w:themeColor="text1"/>
+          <w:kern w:val="0"/>
+          <w:sz w:val="30"/>
+          <w:szCs w:val="30"/>
+          <w:lang w:val="en-US"/>
+        </w:rPr>
+        <w:t>anvi</w:t>
+      </w:r>
+      <w:proofErr w:type="spellEnd"/>
+      <w:r>
+        <w:rPr>
+          <w:rFonts w:ascii="Menlo" w:hAnsi="Menlo" w:cs="Menlo"/>
+          <w:color w:val="000000" w:themeColor="text1"/>
+          <w:kern w:val="0"/>
+          <w:sz w:val="30"/>
+          <w:szCs w:val="30"/>
+          <w:lang w:val="en-US"/>
+        </w:rPr>
+        <w:t>-display-pan -g COLLINSELLA-PROJECT/</w:t>
+      </w:r>
+      <w:proofErr w:type="spellStart"/>
+      <w:r>
+        <w:rPr>
+          <w:rFonts w:ascii="Menlo" w:hAnsi="Menlo" w:cs="Menlo"/>
+          <w:color w:val="000000" w:themeColor="text1"/>
+          <w:kern w:val="0"/>
+          <w:sz w:val="30"/>
+          <w:szCs w:val="30"/>
+          <w:lang w:val="en-US"/>
+        </w:rPr>
+        <w:t>COLLINSELLA_GENOMES.db</w:t>
+      </w:r>
+      <w:proofErr w:type="spellEnd"/>
+      <w:r>
+        <w:rPr>
+          <w:rFonts w:ascii="Menlo" w:hAnsi="Menlo" w:cs="Menlo"/>
+          <w:color w:val="000000" w:themeColor="text1"/>
+          <w:kern w:val="0"/>
+          <w:sz w:val="30"/>
+          <w:szCs w:val="30"/>
+          <w:lang w:val="en-US"/>
+        </w:rPr>
+        <w:t xml:space="preserve"> -p COLLINSELLA-PROJECT/</w:t>
+      </w:r>
+      <w:proofErr w:type="spellStart"/>
+      <w:r>
+        <w:rPr>
+          <w:rFonts w:ascii="Menlo" w:hAnsi="Menlo" w:cs="Menlo"/>
+          <w:color w:val="000000" w:themeColor="text1"/>
+          <w:kern w:val="0"/>
+          <w:sz w:val="30"/>
+          <w:szCs w:val="30"/>
+          <w:lang w:val="en-US"/>
+        </w:rPr>
+        <w:t>Collinsella-PAN.db</w:t>
+      </w:r>
+      <w:proofErr w:type="spellEnd"/>
+    </w:p>
+    <w:p>
+      <w:pPr>
+        <w:spacing w:line="480" w:lineRule="auto"/>
+        <w:jc w:val="both"/>
+        <w:rPr>
+          <w:rFonts w:ascii="Menlo" w:hAnsi="Menlo" w:cs="Menlo"/>
+          <w:color w:val="000000" w:themeColor="text1"/>
+          <w:kern w:val="0"/>
+          <w:sz w:val="30"/>
+          <w:szCs w:val="30"/>
+          <w:lang w:val="en-US"/>
+        </w:rPr>
+      </w:pPr>
+    </w:p>
+    <w:p>
+      <w:pPr>
+        <w:spacing w:line="480" w:lineRule="auto"/>
+        <w:jc w:val="both"/>
+        <w:rPr>
+          <w:rFonts w:ascii="Menlo" w:hAnsi="Menlo" w:cs="Menlo"/>
+          <w:color w:val="000000" w:themeColor="text1"/>
+          <w:kern w:val="0"/>
+          <w:sz w:val="30"/>
+          <w:szCs w:val="30"/>
+          <w:lang w:val="en-US"/>
+        </w:rPr>
+      </w:pPr>
+      <w:r>
+        <w:rPr>
+          <w:rFonts w:ascii="Menlo" w:hAnsi="Menlo" w:cs="Menlo"/>
+          <w:color w:val="000000" w:themeColor="text1"/>
+          <w:kern w:val="0"/>
+          <w:sz w:val="30"/>
+          <w:szCs w:val="30"/>
+          <w:lang w:val="en-US"/>
+        </w:rPr>
+        <w:t xml:space="preserve">And choose the features you want to keep. I think these are useful: </w:t>
+      </w:r>
+    </w:p>
+    <w:p>
+      <w:pPr>
+        <w:spacing w:line="480" w:lineRule="auto"/>
+        <w:jc w:val="both"/>
+        <w:rPr>
+          <w:rFonts w:ascii="Menlo" w:hAnsi="Menlo" w:cs="Menlo"/>
+          <w:color w:val="000000" w:themeColor="text1"/>
+          <w:kern w:val="0"/>
+          <w:sz w:val="30"/>
+          <w:szCs w:val="30"/>
+          <w:lang w:val="en-US"/>
+        </w:rPr>
+      </w:pPr>
+      <w:r>
+        <w:rPr>
+          <w:rFonts w:ascii="Menlo" w:hAnsi="Menlo" w:cs="Menlo"/>
+          <w:color w:val="000000" w:themeColor="text1"/>
+          <w:kern w:val="0"/>
+          <w:sz w:val="30"/>
+          <w:szCs w:val="30"/>
+          <w:lang w:val="en-US"/>
+        </w:rPr>
+        <w:t>Avg AAI</w:t>
+      </w:r>
+      <w:r>
+        <w:rPr>
+          <w:rFonts w:ascii="Menlo" w:hAnsi="Menlo" w:cs="Menlo"/>
+          <w:color w:val="000000" w:themeColor="text1"/>
+          <w:kern w:val="0"/>
+          <w:sz w:val="30"/>
+          <w:szCs w:val="30"/>
+          <w:lang w:val="en-US"/>
+        </w:rPr>
+        <w:br/>
+      </w:r>
+      <w:proofErr w:type="spellStart"/>
+      <w:r>
+        <w:rPr>
+          <w:rFonts w:ascii="Menlo" w:hAnsi="Menlo" w:cs="Menlo"/>
+          <w:color w:val="000000" w:themeColor="text1"/>
+          <w:kern w:val="0"/>
+          <w:sz w:val="30"/>
+          <w:szCs w:val="30"/>
+          <w:lang w:val="en-US"/>
+        </w:rPr>
+        <w:t>KOfam</w:t>
+      </w:r>
+      <w:proofErr w:type="spellEnd"/>
+    </w:p>
+    <w:p>
+      <w:pPr>
+        <w:spacing w:line="480" w:lineRule="auto"/>
+        <w:jc w:val="both"/>
+        <w:rPr>
+          <w:rFonts w:ascii="Menlo" w:hAnsi="Menlo" w:cs="Menlo"/>
+          <w:color w:val="000000" w:themeColor="text1"/>
+          <w:kern w:val="0"/>
+          <w:sz w:val="30"/>
+          <w:szCs w:val="30"/>
+          <w:lang w:val="en-US"/>
+        </w:rPr>
+      </w:pPr>
+      <w:r>
+        <w:rPr>
+          <w:rFonts w:ascii="Menlo" w:hAnsi="Menlo" w:cs="Menlo"/>
+          <w:color w:val="000000" w:themeColor="text1"/>
+          <w:kern w:val="0"/>
+          <w:sz w:val="30"/>
+          <w:szCs w:val="30"/>
+          <w:lang w:val="en-US"/>
+        </w:rPr>
+        <w:t>Kegg Class</w:t>
+      </w:r>
+    </w:p>
+    <w:p>
+      <w:pPr>
+        <w:spacing w:line="480" w:lineRule="auto"/>
+        <w:jc w:val="both"/>
+        <w:rPr>
+          <w:rFonts w:ascii="Menlo" w:hAnsi="Menlo" w:cs="Menlo"/>
+          <w:color w:val="000000" w:themeColor="text1"/>
+          <w:kern w:val="0"/>
+          <w:sz w:val="30"/>
+          <w:szCs w:val="30"/>
+          <w:lang w:val="en-US"/>
+        </w:rPr>
+      </w:pPr>
+      <w:r>
+        <w:rPr>
+          <w:rFonts w:ascii="Menlo" w:hAnsi="Menlo" w:cs="Menlo"/>
+          <w:color w:val="000000" w:themeColor="text1"/>
+          <w:kern w:val="0"/>
+          <w:sz w:val="30"/>
+          <w:szCs w:val="30"/>
+          <w:lang w:val="en-US"/>
+        </w:rPr>
+        <w:t>Kegg Module</w:t>
+      </w:r>
+    </w:p>
+    <w:p>
+      <w:pPr>
+        <w:spacing w:line="480" w:lineRule="auto"/>
+        <w:jc w:val="both"/>
+        <w:rPr>
+          <w:rFonts w:ascii="Times New Roman" w:hAnsi="Times New Roman" w:cs="Times New Roman"/>
+          <w:color w:val="000000" w:themeColor="text1"/>
+          <w:sz w:val="18"/>
+          <w:szCs w:val="18"/>
+          <w:lang w:val="en-US"/>
+        </w:rPr>
+      </w:pPr>
+      <w:r>
+        <w:rPr>
+          <w:rFonts w:ascii="Menlo" w:hAnsi="Menlo" w:cs="Menlo"/>
+          <w:color w:val="000000" w:themeColor="text1"/>
+          <w:kern w:val="0"/>
+          <w:sz w:val="30"/>
+          <w:szCs w:val="30"/>
+          <w:lang w:val="en-US"/>
+        </w:rPr>
+        <w:t>SCG clusters</w:t>
+      </w:r>
     </w:p>
     <w:sectPr>
       <w:pgSz w:w="12240" w:h="15840"/>
@@ -5226,6 +6729,22 @@
     <w:unhideWhenUsed/>
     <w:rsid w:val="00922ED6"/>
   </w:style>
+  <w:style w:type="paragraph" w:styleId="NormalWeb">
+    <w:name w:val="Normal (Web)"/>
+    <w:basedOn w:val="Normal"/>
+    <w:uiPriority w:val="99"/>
+    <w:semiHidden/>
+    <w:unhideWhenUsed/>
+    <w:rsid w:val="00F65384"/>
+    <w:pPr>
+      <w:spacing w:before="100" w:beforeAutospacing="1" w:after="100" w:afterAutospacing="1" w:line="240" w:lineRule="auto"/>
+    </w:pPr>
+    <w:rPr>
+      <w:rFonts w:ascii="Times New Roman" w:eastAsia="Times New Roman" w:hAnsi="Times New Roman" w:cs="Times New Roman"/>
+      <w:kern w:val="0"/>
+      <w14:ligatures w14:val="none"/>
+    </w:rPr>
+  </w:style>
 </w:styles>
 </file>
 

</xml_diff>